<commit_message>
Complete analysis of "Who Knows Like Us" from the full story text
Replace the placeholder sections for the second story with the full plot
(the writer's losses, minimalism, the hidden underwear, the sunset and the
stuck neck) in the outline, presentation and README.

Co-Authored-By: Claude Fable 5.1 <noreply@anthropic.com>
Claude-Session: https://claude.ai/code/session_012ZD2wAUBZdU4RRE8wFJx9h
</commit_message>
<xml_diff>
--- a/seminar/ביבליוגרפיה-וראשי-פרקים.docx
+++ b/seminar/ביבליוגרפיה-וראשי-פרקים.docx
@@ -2510,7 +2510,7 @@
           <w:szCs w:val="28"/>
           <w:rtl/>
         </w:rPr>
-        <w:t xml:space="preserve">פרק 3: "מי כמונו יודע" – דיבור, שותפות ויצירה כדרכי התמודדות</w:t>
+        <w:t xml:space="preserve">פרק 3: "מי כמונו יודע" – דיבור, אידאולוגיה, הסתרה וכתיבה כדרכי התמודדות</w:t>
       </w:r>
     </w:p>
     <w:p>
@@ -2550,7 +2550,70 @@
           <w:szCs w:val="24"/>
           <w:rtl/>
         </w:rPr>
-        <w:t xml:space="preserve">מפגש בבית קפה: אמריקאי, סופר שכתב שלושה ספרים וזכה בפרס, "לא הפסיק לדבר"; כל משפט שני נפתח ב"ומי כמונו יודע..."; המספר-מאזין ותחושת האחדות; התפתחות המפגש וסיומו [להשלים על פי הטקסט המלא].</w:t>
+        <w:t xml:space="preserve">המספר יושב בבית קפה מול סופר אמריקאי "שלא הפסיק לדבר": שלושה ספרים, פרס בין-לאומי "שלא שמעתי עליו מעולם", וכל משפט שני נפתח ב"ומי כמונו יודע...".</w:t>
+      </w:r>
+    </w:p>
+    <w:p>
+      <w:pPr>
+        <w:pStyle w:val="ListParagraph"/>
+        <w:numPr>
+          <w:ilvl w:val="0"/>
+          <w:numId w:val="3"/>
+        </w:numPr>
+        <w:bidi/>
+        <w:spacing w:after="60" w:line="360"/>
+        <w:jc w:val="both"/>
+      </w:pPr>
+      <w:r>
+        <w:rPr>
+          <w:rFonts w:ascii="David" w:cs="David" w:eastAsia="David" w:hAnsi="David"/>
+          <w:sz w:val="24"/>
+          <w:szCs w:val="24"/>
+          <w:rtl/>
+        </w:rPr>
+        <w:t xml:space="preserve">סיפור חייו של הזר: לימודי כתיבה, משפחה, ילד שנהרג בתאונת דרכים, גירושים, גיור והתפקרות, הצטרפות לתנועת מינימליזם – "שני זוגות תחתונים ועט אחד".</w:t>
+      </w:r>
+    </w:p>
+    <w:p>
+      <w:pPr>
+        <w:pStyle w:val="ListParagraph"/>
+        <w:numPr>
+          <w:ilvl w:val="0"/>
+          <w:numId w:val="3"/>
+        </w:numPr>
+        <w:bidi/>
+        <w:spacing w:after="60" w:line="360"/>
+        <w:jc w:val="both"/>
+      </w:pPr>
+      <w:r>
+        <w:rPr>
+          <w:rFonts w:ascii="David" w:cs="David" w:eastAsia="David" w:hAnsi="David"/>
+          <w:sz w:val="24"/>
+          <w:szCs w:val="24"/>
+          <w:rtl/>
+        </w:rPr>
+        <w:t xml:space="preserve">המספר מסתיר שיש לו "לפחות עשרים" זוגות תחתונים – "פחדתי שזה ירחיק בינינו".</w:t>
+      </w:r>
+    </w:p>
+    <w:p>
+      <w:pPr>
+        <w:pStyle w:val="ListParagraph"/>
+        <w:numPr>
+          <w:ilvl w:val="0"/>
+          <w:numId w:val="3"/>
+        </w:numPr>
+        <w:bidi/>
+        <w:spacing w:after="60" w:line="360"/>
+        <w:jc w:val="both"/>
+      </w:pPr>
+      <w:r>
+        <w:rPr>
+          <w:rFonts w:ascii="David" w:cs="David" w:eastAsia="David" w:hAnsi="David"/>
+          <w:sz w:val="24"/>
+          <w:szCs w:val="24"/>
+          <w:rtl/>
+        </w:rPr>
+        <w:t xml:space="preserve">השקיעה: "אתה ואני יכולים, בעזרת הכתיבה, לשמר את היופי הזה לנצח"; הצוואר של המספר מתחיל לכאוב; "גם אני"; והסיום – "הסיפור הבא שלי הולך להיות על מישהו שנתפס לו הצוואר".</w:t>
       </w:r>
     </w:p>
     <w:p>
@@ -2569,28 +2632,28 @@
           <w:szCs w:val="24"/>
           <w:rtl/>
         </w:rPr>
-        <w:t xml:space="preserve">3.2 הקושי: בדידות, ניכור וצורך בהכרה</w:t>
-      </w:r>
-    </w:p>
-    <w:p>
-      <w:pPr>
-        <w:pStyle w:val="ListParagraph"/>
-        <w:numPr>
-          <w:ilvl w:val="0"/>
-          <w:numId w:val="3"/>
-        </w:numPr>
-        <w:bidi/>
-        <w:spacing w:after="60" w:line="360"/>
-        <w:jc w:val="both"/>
-      </w:pPr>
-      <w:r>
-        <w:rPr>
-          <w:rFonts w:ascii="David" w:cs="David" w:eastAsia="David" w:hAnsi="David"/>
-          <w:sz w:val="24"/>
-          <w:szCs w:val="24"/>
-          <w:rtl/>
-        </w:rPr>
-        <w:t xml:space="preserve">הדיבור הכפוי – "כאילו יש לו יותר מדי דברים להגיד והוא חייב להספיק את כולם" – כסימן למצוקה; הסופר שלא שמעו עליו.</w:t>
+        <w:t xml:space="preserve">3.2 הקושי: אובדן, כישלון ובדידות</w:t>
+      </w:r>
+    </w:p>
+    <w:p>
+      <w:pPr>
+        <w:pStyle w:val="ListParagraph"/>
+        <w:numPr>
+          <w:ilvl w:val="0"/>
+          <w:numId w:val="3"/>
+        </w:numPr>
+        <w:bidi/>
+        <w:spacing w:after="60" w:line="360"/>
+        <w:jc w:val="both"/>
+      </w:pPr>
+      <w:r>
+        <w:rPr>
+          <w:rFonts w:ascii="David" w:cs="David" w:eastAsia="David" w:hAnsi="David"/>
+          <w:sz w:val="24"/>
+          <w:szCs w:val="24"/>
+          <w:rtl/>
+        </w:rPr>
+        <w:t xml:space="preserve">אצל הזר – שרשרת אסונות (מות הילד, פירוק המשפחה) ותהייה על ערך היצירה; אצל המספר – מבוכה, בדידות מול זר כופה, וצורך לשמר קשר במחיר של הסתרה.</w:t>
       </w:r>
     </w:p>
     <w:p>
@@ -2630,7 +2693,28 @@
           <w:szCs w:val="24"/>
           <w:rtl/>
         </w:rPr>
-        <w:t xml:space="preserve">הביטוי החוזר יוצר "אנחנו" מדומה; הדיבור כמנגנון ויסות רגשי (Lazarus &amp; Folkman, 1984 – התמודדות ממוקדת-רגש; חיפוש תמיכה חברתית).</w:t>
+        <w:t xml:space="preserve">הביטוי החוזר יוצר "אנחנו" מדומה ומגייס את המאזין לשותפות – דיבור בלתי פוסק כוויסות רגשי וכחיפוש תמיכה חברתית (Lazarus &amp; Folkman, 1984).</w:t>
+      </w:r>
+    </w:p>
+    <w:p>
+      <w:pPr>
+        <w:pStyle w:val="ListParagraph"/>
+        <w:numPr>
+          <w:ilvl w:val="0"/>
+          <w:numId w:val="3"/>
+        </w:numPr>
+        <w:bidi/>
+        <w:spacing w:after="60" w:line="360"/>
+        <w:jc w:val="both"/>
+      </w:pPr>
+      <w:r>
+        <w:rPr>
+          <w:rFonts w:ascii="David" w:cs="David" w:eastAsia="David" w:hAnsi="David"/>
+          <w:sz w:val="24"/>
+          <w:szCs w:val="24"/>
+          <w:rtl/>
+        </w:rPr>
+        <w:t xml:space="preserve">"תאומים סיאמיים... לב אחד גדול וכואב" – הדימוי הגופני-פנטסטי האופייני לקרת: שותפות כפויה של כאב.</w:t>
       </w:r>
     </w:p>
     <w:p>
@@ -2649,28 +2733,49 @@
           <w:szCs w:val="24"/>
           <w:rtl/>
         </w:rPr>
-        <w:t xml:space="preserve">3.4 התמודדות באמצעות שותפות: "תאומים סיאמיים... לב אחד גדול וכואב"</w:t>
-      </w:r>
-    </w:p>
-    <w:p>
-      <w:pPr>
-        <w:pStyle w:val="ListParagraph"/>
-        <w:numPr>
-          <w:ilvl w:val="0"/>
-          <w:numId w:val="3"/>
-        </w:numPr>
-        <w:bidi/>
-        <w:spacing w:after="60" w:line="360"/>
-        <w:jc w:val="both"/>
-      </w:pPr>
-      <w:r>
-        <w:rPr>
-          <w:rFonts w:ascii="David" w:cs="David" w:eastAsia="David" w:hAnsi="David"/>
-          <w:sz w:val="24"/>
-          <w:szCs w:val="24"/>
-          <w:rtl/>
-        </w:rPr>
-        <w:t xml:space="preserve">הדימוי הפנטסטי-גופני של קרת; אמפתיה כפויה לעומת אמפתיה אמיתית; המטרונום כפעימה משותפת של כאב.</w:t>
+        <w:t xml:space="preserve">3.4 התמודדות באמצעות אידאולוגיה: המינימליזם והחלפת האמונות</w:t>
+      </w:r>
+    </w:p>
+    <w:p>
+      <w:pPr>
+        <w:pStyle w:val="ListParagraph"/>
+        <w:numPr>
+          <w:ilvl w:val="0"/>
+          <w:numId w:val="3"/>
+        </w:numPr>
+        <w:bidi/>
+        <w:spacing w:after="60" w:line="360"/>
+        <w:jc w:val="both"/>
+      </w:pPr>
+      <w:r>
+        <w:rPr>
+          <w:rFonts w:ascii="David" w:cs="David" w:eastAsia="David" w:hAnsi="David"/>
+          <w:sz w:val="24"/>
+          <w:szCs w:val="24"/>
+          <w:rtl/>
+        </w:rPr>
+        <w:t xml:space="preserve">גיור, התפקרות, מינימליזם, "עט אחד זה די והותר" – הזר מגיב לאובדן בבנייה מחדש של חוקי חיים (קצמן, 2005: געגוע לעולם בעל חוקים משלו).</w:t>
+      </w:r>
+    </w:p>
+    <w:p>
+      <w:pPr>
+        <w:pStyle w:val="ListParagraph"/>
+        <w:numPr>
+          <w:ilvl w:val="0"/>
+          <w:numId w:val="3"/>
+        </w:numPr>
+        <w:bidi/>
+        <w:spacing w:after="60" w:line="360"/>
+        <w:jc w:val="both"/>
+      </w:pPr>
+      <w:r>
+        <w:rPr>
+          <w:rFonts w:ascii="David" w:cs="David" w:eastAsia="David" w:hAnsi="David"/>
+          <w:sz w:val="24"/>
+          <w:szCs w:val="24"/>
+          <w:rtl/>
+        </w:rPr>
+        <w:t xml:space="preserve">לכאורה התמודדות ממוקדת-בעיה, למעשה הימנעות: הצמצום החומרי כתחליף לעיבוד האבל (Rubin, 1999 – מסלול התפקוד לעומת מסלול הקשר).</w:t>
       </w:r>
     </w:p>
     <w:p>
@@ -2689,28 +2794,28 @@
           <w:szCs w:val="24"/>
           <w:rtl/>
         </w:rPr>
-        <w:t xml:space="preserve">3.5 התמודדות באמצעות יצירה: "יצירה היא בסך הכול פעולת הסחה"</w:t>
-      </w:r>
-    </w:p>
-    <w:p>
-      <w:pPr>
-        <w:pStyle w:val="ListParagraph"/>
-        <w:numPr>
-          <w:ilvl w:val="0"/>
-          <w:numId w:val="3"/>
-        </w:numPr>
-        <w:bidi/>
-        <w:spacing w:after="60" w:line="360"/>
-        <w:jc w:val="both"/>
-      </w:pPr>
-      <w:r>
-        <w:rPr>
-          <w:rFonts w:ascii="David" w:cs="David" w:eastAsia="David" w:hAnsi="David"/>
-          <w:sz w:val="24"/>
-          <w:szCs w:val="24"/>
-          <w:rtl/>
-        </w:rPr>
-        <w:t xml:space="preserve">הכתיבה כהסחת דעת מן המציאות – עמדה מטא-פואטית של קרת על תפקיד הספרות בהתמודדות (קצמן, 2005; טאוב, 1997).</w:t>
+        <w:t xml:space="preserve">3.5 התמודדות באמצעות הסתרה והסכמה: התחתונים והשקיעה</w:t>
+      </w:r>
+    </w:p>
+    <w:p>
+      <w:pPr>
+        <w:pStyle w:val="ListParagraph"/>
+        <w:numPr>
+          <w:ilvl w:val="0"/>
+          <w:numId w:val="3"/>
+        </w:numPr>
+        <w:bidi/>
+        <w:spacing w:after="60" w:line="360"/>
+        <w:jc w:val="both"/>
+      </w:pPr>
+      <w:r>
+        <w:rPr>
+          <w:rFonts w:ascii="David" w:cs="David" w:eastAsia="David" w:hAnsi="David"/>
+          <w:sz w:val="24"/>
+          <w:szCs w:val="24"/>
+          <w:rtl/>
+        </w:rPr>
+        <w:t xml:space="preserve">המספר מסתיר את האמת, מהנהן, מסתובב "מתוך נימוס" – התמודדות ממוקדת-רגש ששומרת על הקשר במחיר של ויתור על העצמי ועל הגוף (הצוואר).</w:t>
       </w:r>
     </w:p>
     <w:p>
@@ -2729,28 +2834,110 @@
           <w:szCs w:val="24"/>
           <w:rtl/>
         </w:rPr>
-        <w:t xml:space="preserve">3.6 הסיום ומשמעותו</w:t>
-      </w:r>
-    </w:p>
-    <w:p>
-      <w:pPr>
-        <w:pStyle w:val="ListParagraph"/>
-        <w:numPr>
-          <w:ilvl w:val="0"/>
-          <w:numId w:val="3"/>
-        </w:numPr>
-        <w:bidi/>
-        <w:spacing w:after="60" w:line="360"/>
-        <w:jc w:val="both"/>
-      </w:pPr>
-      <w:r>
-        <w:rPr>
-          <w:rFonts w:ascii="David" w:cs="David" w:eastAsia="David" w:hAnsi="David"/>
-          <w:sz w:val="24"/>
-          <w:szCs w:val="24"/>
-          <w:rtl/>
-        </w:rPr>
-        <w:t xml:space="preserve">מה קורה ל"אנחנו" בסיום: האם השותפות מחזיקה מעמד או מתפרקת; מה למד המספר-המאזין. [להשלים על פי הטקסט המלא]</w:t>
+        <w:t xml:space="preserve">3.6 התמודדות באמצעות כתיבה: "פעולת הסחה" או "לשמר את היופי לנצח"?</w:t>
+      </w:r>
+    </w:p>
+    <w:p>
+      <w:pPr>
+        <w:pStyle w:val="ListParagraph"/>
+        <w:numPr>
+          <w:ilvl w:val="0"/>
+          <w:numId w:val="3"/>
+        </w:numPr>
+        <w:bidi/>
+        <w:spacing w:after="60" w:line="360"/>
+        <w:jc w:val="both"/>
+      </w:pPr>
+      <w:r>
+        <w:rPr>
+          <w:rFonts w:ascii="David" w:cs="David" w:eastAsia="David" w:hAnsi="David"/>
+          <w:sz w:val="24"/>
+          <w:szCs w:val="24"/>
+          <w:rtl/>
+        </w:rPr>
+        <w:t xml:space="preserve">הסתירה בדברי הזר: היצירה היא "מראית עין של מציאות קרנבלית" המסיחה מן "המציאות האמיתית הקרה" – ובה בעת כלי לשמר יופי לנצח. שתי העמדות הן דרכי בריחה מן הכאב (טאוב, 1997).</w:t>
+      </w:r>
+    </w:p>
+    <w:p>
+      <w:pPr>
+        <w:pStyle w:val="ListParagraph"/>
+        <w:numPr>
+          <w:ilvl w:val="0"/>
+          <w:numId w:val="3"/>
+        </w:numPr>
+        <w:bidi/>
+        <w:spacing w:after="60" w:line="360"/>
+        <w:jc w:val="both"/>
+      </w:pPr>
+      <w:r>
+        <w:rPr>
+          <w:rFonts w:ascii="David" w:cs="David" w:eastAsia="David" w:hAnsi="David"/>
+          <w:sz w:val="24"/>
+          <w:szCs w:val="24"/>
+          <w:rtl/>
+        </w:rPr>
+        <w:t xml:space="preserve">"אני הולך לכתוב על השקיעה הזאת" – ההכרזה "נשמעת כמעט כמו איום": הכתיבה כתחרות וכשליטה.</w:t>
+      </w:r>
+    </w:p>
+    <w:p>
+      <w:pPr>
+        <w:pStyle w:val="Heading3"/>
+        <w:bidi/>
+        <w:spacing w:after="80" w:before="160" w:line="360"/>
+        <w:jc w:val="right"/>
+      </w:pPr>
+      <w:r>
+        <w:rPr>
+          <w:rFonts w:ascii="David" w:cs="David" w:eastAsia="David" w:hAnsi="David"/>
+          <w:b/>
+          <w:bCs/>
+          <w:sz w:val="24"/>
+          <w:szCs w:val="24"/>
+          <w:rtl/>
+        </w:rPr>
+        <w:t xml:space="preserve">3.7 הסיום: הצוואר במקום השקיעה</w:t>
+      </w:r>
+    </w:p>
+    <w:p>
+      <w:pPr>
+        <w:pStyle w:val="ListParagraph"/>
+        <w:numPr>
+          <w:ilvl w:val="0"/>
+          <w:numId w:val="3"/>
+        </w:numPr>
+        <w:bidi/>
+        <w:spacing w:after="60" w:line="360"/>
+        <w:jc w:val="both"/>
+      </w:pPr>
+      <w:r>
+        <w:rPr>
+          <w:rFonts w:ascii="David" w:cs="David" w:eastAsia="David" w:hAnsi="David"/>
+          <w:sz w:val="24"/>
+          <w:szCs w:val="24"/>
+          <w:rtl/>
+        </w:rPr>
+        <w:t xml:space="preserve">המספר לא יכתוב על הנשגב אלא על הכאב הקטן והגופני – ההומור והבנאלי ("סתם") כדרך התמודדות כנה יותר (Schwartz, 2018; מנדלסון-מעוז, 1998).</w:t>
+      </w:r>
+    </w:p>
+    <w:p>
+      <w:pPr>
+        <w:pStyle w:val="ListParagraph"/>
+        <w:numPr>
+          <w:ilvl w:val="0"/>
+          <w:numId w:val="3"/>
+        </w:numPr>
+        <w:bidi/>
+        <w:spacing w:after="60" w:line="360"/>
+        <w:jc w:val="both"/>
+      </w:pPr>
+      <w:r>
+        <w:rPr>
+          <w:rFonts w:ascii="David" w:cs="David" w:eastAsia="David" w:hAnsi="David"/>
+          <w:sz w:val="24"/>
+          <w:szCs w:val="24"/>
+          <w:rtl/>
+        </w:rPr>
+        <w:t xml:space="preserve">הסיפור שאנחנו קוראים הוא-הוא הסיפור "על מישהו שנתפס לו הצוואר" – הכתיבה כדרך של קרת להתמודד עם המפגש, בלי "אנחנו" מזויף.</w:t>
       </w:r>
     </w:p>
     <w:p>
@@ -2937,7 +3124,7 @@
                 <w:szCs w:val="22"/>
                 <w:rtl/>
               </w:rPr>
-              <w:t xml:space="preserve">פחד מפלישה, אובדן הורים, בדידות</w:t>
+              <w:t xml:space="preserve">פחד מפלישה, אובדן ההורים, בדידות</w:t>
             </w:r>
           </w:p>
         </w:tc>
@@ -2966,7 +3153,7 @@
                 <w:szCs w:val="22"/>
                 <w:rtl/>
               </w:rPr>
-              <w:t xml:space="preserve">בדידות, ניכור, צורך בהכרה</w:t>
+              <w:t xml:space="preserve">אובדן ילד וגירושים (הזר); בדידות ומבוכה (המספר)</w:t>
             </w:r>
           </w:p>
         </w:tc>
@@ -3144,7 +3331,7 @@
                 <w:szCs w:val="22"/>
                 <w:rtl/>
               </w:rPr>
-              <w:t xml:space="preserve">דיבור בלתי פוסק, נוסחת שייכות, יצירה</w:t>
+              <w:t xml:space="preserve">דיבור בלתי פוסק, מינימליזם ואידאולוגיה, הסתרה, כתיבה</w:t>
             </w:r>
           </w:p>
         </w:tc>
@@ -3411,7 +3598,7 @@
                 <w:szCs w:val="22"/>
                 <w:rtl/>
               </w:rPr>
-              <w:t xml:space="preserve">אחדות מדומה, כאב משותף [להשלים]</w:t>
+              <w:t xml:space="preserve">ויתור על העצמי, "אנחנו" מזויף, צוואר תפוס</w:t>
             </w:r>
           </w:p>
         </w:tc>
@@ -3451,7 +3638,7 @@
           <w:szCs w:val="24"/>
           <w:rtl/>
         </w:rPr>
-        <w:t xml:space="preserve">סעיפי הפרק: 4.1 דמיון – הפנטזיה כדרך לחיות עם קושי; 4.2 שוני – שתיקה מול דיבור, הסתגרות מול חיבור; 4.3 המספר בגוף ראשון כמאזין פסיבי בשני הסיפורים; 4.4 מן המוקדם אל המאוחר: מה השתנה בדרכי ההתמודדות בכתיבתו של קרת.</w:t>
+        <w:t xml:space="preserve">סעיפי הפרק: 4.1 דמיון – הפנטזיה כדרך לחיות עם קושי; 4.2 שוני – שתיקה מול דיבור, הסתגרות מול חיבור; 4.3 המספר בגוף ראשון כמאזין פסיבי בשני הסיפורים – הילד ששותק והמבוגר שמהנהן; 4.4 מן המוקדם אל המאוחר: מ"סתם קולות" אל "סתם צוואר" – הכתיבה עצמה נעשית דרך ההתמודדות.</w:t>
       </w:r>
     </w:p>
     <w:p>

</xml_diff>

<commit_message>
Add list of six peer-reviewed articles with full-text access
Replace the book-heavy core bibliography with six peer-reviewed journal
articles (two Hebrew, four English) that have full-text access, add a
separate Word file describing each article's journal, access link and
contribution, and update the presentation and README accordingly.

Co-Authored-By: Claude Fable 5.1 <noreply@anthropic.com>
Claude-Session: https://claude.ai/code/session_012ZD2wAUBZdU4RRE8wFJx9h
</commit_message>
<xml_diff>
--- a/seminar/ביבליוגרפיה-וראשי-פרקים.docx
+++ b/seminar/ביבליוגרפיה-וראשי-פרקים.docx
@@ -205,7 +205,7 @@
           <w:szCs w:val="24"/>
           <w:rtl/>
         </w:rPr>
-        <w:t xml:space="preserve">הרשימה בנויה משלושה מעגלים: (1) המקורות הראשוניים – שני הסיפורים; (2) שישה מקורות מחקר עיקריים – ארבעה על יצירתו של אתגר קרת ושניים מתחום הפסיכולוגיה של ההתמודדות והאובדן; (3) מקורות נוספים להרחבה, לפי הצורך ובאישור המרצה. סך המקורות העיקריים (2 + 6 = 8) עומד בדרישת העבודה ל-7–10 מקורות. הרשימה ערוכה לפי כללי APA 7: מקורות בעברית לפי סדר אלף-בית של שם המשפחה, ואחריהם מקורות באנגלית לפי סדר ה-ABC.</w:t>
+        <w:t xml:space="preserve">הרשימה בנויה משלושה מעגלים: (1) המקורות הראשוניים – שני הסיפורים; (2) שישה מאמרים שפיטים עיקריים, שניים בעברית וארבעה באנגלית, שכולם זמינים בטקסט מלא; (3) מקורות משלימים (ספרים ומאמרים נוספים) להרחבה, לפי הצורך ובאישור המרצה. סך המקורות העיקריים (2 + 6 = 8) עומד בדרישת העבודה ל-7–10 מקורות. הרשימה ערוכה לפי כללי APA 7: מקורות בעברית לפי סדר אלף-בית של שם המשפחה, ואחריהם מקורות באנגלית לפי סדר ה-ABC.</w:t>
       </w:r>
     </w:p>
     <w:p>
@@ -337,7 +337,7 @@
           <w:szCs w:val="28"/>
           <w:rtl/>
         </w:rPr>
-        <w:t xml:space="preserve">2. מקורות מחקר עיקריים – שישה מאמרים וספרים</w:t>
+        <w:t xml:space="preserve">2. שישה מאמרים שפיטים עיקריים (טקסט מלא זמין)</w:t>
       </w:r>
     </w:p>
     <w:p>
@@ -356,7 +356,7 @@
           <w:szCs w:val="24"/>
           <w:rtl/>
         </w:rPr>
-        <w:t xml:space="preserve">2.1 מחקר על יצירתו של אתגר קרת</w:t>
+        <w:t xml:space="preserve">2.1 בעברית</w:t>
       </w:r>
     </w:p>
     <w:p>
@@ -373,7 +373,7 @@
           <w:szCs w:val="24"/>
           <w:rtl/>
         </w:rPr>
-        <w:t xml:space="preserve">טאוב, ג' (1997). </w:t>
+        <w:t xml:space="preserve">כהן, ד' (2015). בשני צירים שונים: תהליך האבל והתקשורת של הורים ואחים שכולים לאחר אבדן ילד בוגר. </w:t>
       </w:r>
       <w:r>
         <w:rPr>
@@ -384,16 +384,16 @@
           <w:szCs w:val="24"/>
           <w:rtl/>
         </w:rPr>
-        <w:t xml:space="preserve">המרד השפוף: על תרבות צעירה בישראל</w:t>
-      </w:r>
-      <w:r>
-        <w:rPr>
-          <w:rFonts w:ascii="David" w:cs="David" w:eastAsia="David" w:hAnsi="David"/>
-          <w:sz w:val="24"/>
-          <w:szCs w:val="24"/>
-          <w:rtl/>
-        </w:rPr>
-        <w:t xml:space="preserve">. הקיבוץ המאוחד.</w:t>
+        <w:t xml:space="preserve">מפגש לעבודה חינוכית-סוציאלית</w:t>
+      </w:r>
+      <w:r>
+        <w:rPr>
+          <w:rFonts w:ascii="David" w:cs="David" w:eastAsia="David" w:hAnsi="David"/>
+          <w:sz w:val="24"/>
+          <w:szCs w:val="24"/>
+          <w:rtl/>
+        </w:rPr>
+        <w:t xml:space="preserve">, כג(41). https://kitvei-et.efshar.org.il</w:t>
       </w:r>
     </w:p>
     <w:p>
@@ -410,7 +410,7 @@
           <w:szCs w:val="24"/>
           <w:rtl/>
         </w:rPr>
-        <w:t xml:space="preserve">מנדלסון-מעוז, ע' (1998). סיטואציות קיצוניות, זוועתיות וגרוטסקיות ביצירותיהם של קסטל-בלום וקרת. </w:t>
+        <w:t xml:space="preserve">קצמן, ר' (2005). געגועים למיתוס: אישיות, אתיקה ואידאולוגיה במיתופואסיס הפוסטמודרני של אתגר קרת. </w:t>
       </w:r>
       <w:r>
         <w:rPr>
@@ -421,43 +421,6 @@
           <w:szCs w:val="24"/>
           <w:rtl/>
         </w:rPr>
-        <w:t xml:space="preserve">דפים למחקר בספרות</w:t>
-      </w:r>
-      <w:r>
-        <w:rPr>
-          <w:rFonts w:ascii="David" w:cs="David" w:eastAsia="David" w:hAnsi="David"/>
-          <w:sz w:val="24"/>
-          <w:szCs w:val="24"/>
-          <w:rtl/>
-        </w:rPr>
-        <w:t xml:space="preserve">, 11, 269–295.</w:t>
-      </w:r>
-    </w:p>
-    <w:p>
-      <w:pPr>
-        <w:bidi/>
-        <w:spacing w:after="160" w:line="360"/>
-        <w:ind w:left="720" w:hanging="720"/>
-        <w:jc w:val="right"/>
-      </w:pPr>
-      <w:r>
-        <w:rPr>
-          <w:rFonts w:ascii="David" w:cs="David" w:eastAsia="David" w:hAnsi="David"/>
-          <w:sz w:val="24"/>
-          <w:szCs w:val="24"/>
-          <w:rtl/>
-        </w:rPr>
-        <w:t xml:space="preserve">קצמן, ר' (2005). געגועים למיתוס: אישיות, אתיקה ואידיאולוגיה במיתופואסיס הפוסטמודרני של אתגר קרת. </w:t>
-      </w:r>
-      <w:r>
-        <w:rPr>
-          <w:rFonts w:ascii="David" w:cs="David" w:eastAsia="David" w:hAnsi="David"/>
-          <w:i/>
-          <w:iCs/>
-          <w:sz w:val="24"/>
-          <w:szCs w:val="24"/>
-          <w:rtl/>
-        </w:rPr>
         <w:t xml:space="preserve">מכאן</w:t>
       </w:r>
       <w:r>
@@ -468,6 +431,25 @@
           <w:rtl/>
         </w:rPr>
         <w:t xml:space="preserve">, ד, 20–41.</w:t>
+      </w:r>
+    </w:p>
+    <w:p>
+      <w:pPr>
+        <w:pStyle w:val="Heading3"/>
+        <w:bidi/>
+        <w:spacing w:after="80" w:before="160" w:line="360"/>
+        <w:jc w:val="right"/>
+      </w:pPr>
+      <w:r>
+        <w:rPr>
+          <w:rFonts w:ascii="David" w:cs="David" w:eastAsia="David" w:hAnsi="David"/>
+          <w:b/>
+          <w:bCs/>
+          <w:sz w:val="24"/>
+          <w:szCs w:val="24"/>
+          <w:rtl/>
+        </w:rPr>
+        <w:t xml:space="preserve">2.2 באנגלית</w:t>
       </w:r>
     </w:p>
     <w:p>
@@ -482,7 +464,7 @@
           <w:sz w:val="24"/>
           <w:szCs w:val="24"/>
         </w:rPr>
-        <w:t xml:space="preserve">Omer-Sherman, R. (2020). "To extract from it some sort of beautiful thing": The Holocaust in the families and fiction of Nava Semel and Etgar Keret. </w:t>
+        <w:t xml:space="preserve">Abramovich, D. (2019). Israeli Holocaust memory in a short story by Etgar Keret. </w:t>
       </w:r>
       <w:r>
         <w:rPr>
@@ -492,34 +474,15 @@
           <w:sz w:val="24"/>
           <w:szCs w:val="24"/>
         </w:rPr>
-        <w:t xml:space="preserve">Humanities, 9</w:t>
-      </w:r>
-      <w:r>
-        <w:rPr>
-          <w:rFonts w:ascii="David" w:cs="David" w:eastAsia="David" w:hAnsi="David"/>
-          <w:sz w:val="24"/>
-          <w:szCs w:val="24"/>
-        </w:rPr>
-        <w:t xml:space="preserve">(4), Article 137. https://doi.org/10.3390/h9040137</w:t>
-      </w:r>
-    </w:p>
-    <w:p>
-      <w:pPr>
-        <w:pStyle w:val="Heading3"/>
-        <w:bidi/>
-        <w:spacing w:after="80" w:before="160" w:line="360"/>
-        <w:jc w:val="right"/>
-      </w:pPr>
-      <w:r>
-        <w:rPr>
-          <w:rFonts w:ascii="David" w:cs="David" w:eastAsia="David" w:hAnsi="David"/>
-          <w:b/>
-          <w:bCs/>
-          <w:sz w:val="24"/>
-          <w:szCs w:val="24"/>
-          <w:rtl/>
-        </w:rPr>
-        <w:t xml:space="preserve">2.2 רקע תאורטי – התמודדות, לחץ ואובדן</w:t>
+        <w:t xml:space="preserve">Australian Journal of Jewish Studies, 32</w:t>
+      </w:r>
+      <w:r>
+        <w:rPr>
+          <w:rFonts w:ascii="David" w:cs="David" w:eastAsia="David" w:hAnsi="David"/>
+          <w:sz w:val="24"/>
+          <w:szCs w:val="24"/>
+        </w:rPr>
+        <w:t xml:space="preserve">, 21–33.</w:t>
       </w:r>
     </w:p>
     <w:p>
@@ -534,7 +497,7 @@
           <w:sz w:val="24"/>
           <w:szCs w:val="24"/>
         </w:rPr>
-        <w:t xml:space="preserve">Lazarus, R. S., &amp; Folkman, S. (1984). </w:t>
+        <w:t xml:space="preserve">Mendelson-Maoz, A. (2018). Keret's "living-dead" and the sacrifice of Israeli masculinity. </w:t>
       </w:r>
       <w:r>
         <w:rPr>
@@ -544,15 +507,15 @@
           <w:sz w:val="24"/>
           <w:szCs w:val="24"/>
         </w:rPr>
-        <w:t xml:space="preserve">Stress, appraisal, and coping</w:t>
-      </w:r>
-      <w:r>
-        <w:rPr>
-          <w:rFonts w:ascii="David" w:cs="David" w:eastAsia="David" w:hAnsi="David"/>
-          <w:sz w:val="24"/>
-          <w:szCs w:val="24"/>
-        </w:rPr>
-        <w:t xml:space="preserve">. Springer.</w:t>
+        <w:t xml:space="preserve">BGU Review: A Journal of Israeli Culture</w:t>
+      </w:r>
+      <w:r>
+        <w:rPr>
+          <w:rFonts w:ascii="David" w:cs="David" w:eastAsia="David" w:hAnsi="David"/>
+          <w:sz w:val="24"/>
+          <w:szCs w:val="24"/>
+        </w:rPr>
+        <w:t xml:space="preserve">, Winter 2018.</w:t>
       </w:r>
     </w:p>
     <w:p>
@@ -567,7 +530,7 @@
           <w:sz w:val="24"/>
           <w:szCs w:val="24"/>
         </w:rPr>
-        <w:t xml:space="preserve">Rubin, S. S. (1999). The two-track model of bereavement: Overview, retrospect, and prospect. </w:t>
+        <w:t xml:space="preserve">Omer-Sherman, R. (2020). "To extract from it some sort of beautiful thing": The Holocaust in the families and fiction of Nava Semel and Etgar Keret. </w:t>
       </w:r>
       <w:r>
         <w:rPr>
@@ -577,15 +540,68 @@
           <w:sz w:val="24"/>
           <w:szCs w:val="24"/>
         </w:rPr>
-        <w:t xml:space="preserve">Death Studies, 23</w:t>
-      </w:r>
-      <w:r>
-        <w:rPr>
-          <w:rFonts w:ascii="David" w:cs="David" w:eastAsia="David" w:hAnsi="David"/>
-          <w:sz w:val="24"/>
-          <w:szCs w:val="24"/>
-        </w:rPr>
-        <w:t xml:space="preserve">(8), 681–714. https://doi.org/10.1080/074811899200731</w:t>
+        <w:t xml:space="preserve">Humanities, 9</w:t>
+      </w:r>
+      <w:r>
+        <w:rPr>
+          <w:rFonts w:ascii="David" w:cs="David" w:eastAsia="David" w:hAnsi="David"/>
+          <w:sz w:val="24"/>
+          <w:szCs w:val="24"/>
+        </w:rPr>
+        <w:t xml:space="preserve">(4), Article 137. https://doi.org/10.3390/h9040137</w:t>
+      </w:r>
+    </w:p>
+    <w:p>
+      <w:pPr>
+        <w:spacing w:after="160" w:line="360"/>
+        <w:ind w:left="720" w:hanging="720"/>
+        <w:jc w:val="left"/>
+      </w:pPr>
+      <w:r>
+        <w:rPr>
+          <w:rFonts w:ascii="David" w:cs="David" w:eastAsia="David" w:hAnsi="David"/>
+          <w:sz w:val="24"/>
+          <w:szCs w:val="24"/>
+        </w:rPr>
+        <w:t xml:space="preserve">Schwartz, Y. (2018). Stam: The unbearable lightness of banality, or on the nature of Etgar Keret's humor. </w:t>
+      </w:r>
+      <w:r>
+        <w:rPr>
+          <w:rFonts w:ascii="David" w:cs="David" w:eastAsia="David" w:hAnsi="David"/>
+          <w:i/>
+          <w:iCs/>
+          <w:sz w:val="24"/>
+          <w:szCs w:val="24"/>
+        </w:rPr>
+        <w:t xml:space="preserve">BGU Review: A Journal of Israeli Culture</w:t>
+      </w:r>
+      <w:r>
+        <w:rPr>
+          <w:rFonts w:ascii="David" w:cs="David" w:eastAsia="David" w:hAnsi="David"/>
+          <w:sz w:val="24"/>
+          <w:szCs w:val="24"/>
+        </w:rPr>
+        <w:t xml:space="preserve">, Winter 2018.</w:t>
+      </w:r>
+    </w:p>
+    <w:p>
+      <w:pPr>
+        <w:shd w:fill="F2F2F2" w:color="auto" w:val="clear"/>
+        <w:bidi/>
+        <w:spacing w:after="120" w:line="360"/>
+        <w:jc w:val="right"/>
+      </w:pPr>
+      <w:r>
+        <w:rPr>
+          <w:rFonts w:ascii="David" w:cs="David" w:eastAsia="David" w:hAnsi="David"/>
+          <w:i/>
+          <w:iCs/>
+          <w:color w:val="555555"/>
+          <w:sz w:val="24"/>
+          <w:szCs w:val="24"/>
+          <w:rtl/>
+        </w:rPr>
+        <w:t xml:space="preserve">קישורים לטקסט המלא של כל מאמר, פרטי כתב העת ותרומתו לעבודה – בקובץ הנפרד "רשימת מאמרים שפיטים".</w:t>
       </w:r>
     </w:p>
     <w:p>
@@ -604,7 +620,7 @@
           <w:szCs w:val="28"/>
           <w:rtl/>
         </w:rPr>
-        <w:t xml:space="preserve">3. מקורות נוספים להרחבה (אופציונלי)</w:t>
+        <w:t xml:space="preserve">3. מקורות משלימים (ספרים ומאמרים נוספים, אופציונלי)</w:t>
       </w:r>
     </w:p>
     <w:p>
@@ -621,7 +637,7 @@
           <w:szCs w:val="24"/>
           <w:rtl/>
         </w:rPr>
-        <w:t xml:space="preserve">הולצמן, א' (2005). </w:t>
+        <w:t xml:space="preserve">טאוב, ג' (1997). </w:t>
       </w:r>
       <w:r>
         <w:rPr>
@@ -632,7 +648,7 @@
           <w:szCs w:val="24"/>
           <w:rtl/>
         </w:rPr>
-        <w:t xml:space="preserve">מפת דרכים: סיפורת עברית כיום</w:t>
+        <w:t xml:space="preserve">המרד השפוף: על תרבות צעירה בישראל</w:t>
       </w:r>
       <w:r>
         <w:rPr>
@@ -679,6 +695,43 @@
           <w:rtl/>
         </w:rPr>
         <w:t xml:space="preserve">. עם עובד.</w:t>
+      </w:r>
+    </w:p>
+    <w:p>
+      <w:pPr>
+        <w:bidi/>
+        <w:spacing w:after="160" w:line="360"/>
+        <w:ind w:left="720" w:hanging="720"/>
+        <w:jc w:val="right"/>
+      </w:pPr>
+      <w:r>
+        <w:rPr>
+          <w:rFonts w:ascii="David" w:cs="David" w:eastAsia="David" w:hAnsi="David"/>
+          <w:sz w:val="24"/>
+          <w:szCs w:val="24"/>
+          <w:rtl/>
+        </w:rPr>
+        <w:t xml:space="preserve">מנדלסון-מעוז, ע' (1998). סיטואציות קיצוניות, זוועתיות וגרוטסקיות ביצירותיהם של קסטל-בלום וקרת. </w:t>
+      </w:r>
+      <w:r>
+        <w:rPr>
+          <w:rFonts w:ascii="David" w:cs="David" w:eastAsia="David" w:hAnsi="David"/>
+          <w:i/>
+          <w:iCs/>
+          <w:sz w:val="24"/>
+          <w:szCs w:val="24"/>
+          <w:rtl/>
+        </w:rPr>
+        <w:t xml:space="preserve">דפים למחקר בספרות</w:t>
+      </w:r>
+      <w:r>
+        <w:rPr>
+          <w:rFonts w:ascii="David" w:cs="David" w:eastAsia="David" w:hAnsi="David"/>
+          <w:sz w:val="24"/>
+          <w:szCs w:val="24"/>
+          <w:rtl/>
+        </w:rPr>
+        <w:t xml:space="preserve">, 11, 269–295.</w:t>
       </w:r>
     </w:p>
     <w:p>
@@ -693,7 +746,7 @@
           <w:sz w:val="24"/>
           <w:szCs w:val="24"/>
         </w:rPr>
-        <w:t xml:space="preserve">Kubovy, M. (2000). Inniut and kooliut: Trends in Israeli narrative literature, 1995–1999. </w:t>
+        <w:t xml:space="preserve">Buchweitz, N. (2018). The Seven Good Years as Etgar Keret's poetic credo. </w:t>
       </w:r>
       <w:r>
         <w:rPr>
@@ -703,15 +756,15 @@
           <w:sz w:val="24"/>
           <w:szCs w:val="24"/>
         </w:rPr>
-        <w:t xml:space="preserve">Israel Studies, 5</w:t>
-      </w:r>
-      <w:r>
-        <w:rPr>
-          <w:rFonts w:ascii="David" w:cs="David" w:eastAsia="David" w:hAnsi="David"/>
-          <w:sz w:val="24"/>
-          <w:szCs w:val="24"/>
-        </w:rPr>
-        <w:t xml:space="preserve">(1), 244–265.</w:t>
+        <w:t xml:space="preserve">BGU Review: A Journal of Israeli Culture</w:t>
+      </w:r>
+      <w:r>
+        <w:rPr>
+          <w:rFonts w:ascii="David" w:cs="David" w:eastAsia="David" w:hAnsi="David"/>
+          <w:sz w:val="24"/>
+          <w:szCs w:val="24"/>
+        </w:rPr>
+        <w:t xml:space="preserve">, Winter 2018.</w:t>
       </w:r>
     </w:p>
     <w:p>
@@ -726,7 +779,7 @@
           <w:sz w:val="24"/>
           <w:szCs w:val="24"/>
         </w:rPr>
-        <w:t xml:space="preserve">Schwartz, Y. (2018). Stam: The unbearable lightness of banality, or on the nature of Etgar Keret's humor. </w:t>
+        <w:t xml:space="preserve">Karti Shemtov, V. (2018). A sense of no ending, part 2: Etgar Keret and the changing concept of time in contemporary Hebrew literature. </w:t>
       </w:r>
       <w:r>
         <w:rPr>
@@ -736,15 +789,15 @@
           <w:sz w:val="24"/>
           <w:szCs w:val="24"/>
         </w:rPr>
-        <w:t xml:space="preserve">BGU Review: A Journal of Israeli Culture</w:t>
-      </w:r>
-      <w:r>
-        <w:rPr>
-          <w:rFonts w:ascii="David" w:cs="David" w:eastAsia="David" w:hAnsi="David"/>
-          <w:sz w:val="24"/>
-          <w:szCs w:val="24"/>
-        </w:rPr>
-        <w:t xml:space="preserve">, Winter 2018.</w:t>
+        <w:t xml:space="preserve">Dibur Literary Journal, 6</w:t>
+      </w:r>
+      <w:r>
+        <w:rPr>
+          <w:rFonts w:ascii="David" w:cs="David" w:eastAsia="David" w:hAnsi="David"/>
+          <w:sz w:val="24"/>
+          <w:szCs w:val="24"/>
+        </w:rPr>
+        <w:t xml:space="preserve">, 57–64.</w:t>
       </w:r>
     </w:p>
     <w:p>
@@ -759,7 +812,7 @@
           <w:sz w:val="24"/>
           <w:szCs w:val="24"/>
         </w:rPr>
-        <w:t xml:space="preserve">Seliger, Y. (2021). </w:t>
+        <w:t xml:space="preserve">Katsman, R. (2013). Etgar Keret: The minimal metaphysical origin. </w:t>
       </w:r>
       <w:r>
         <w:rPr>
@@ -769,15 +822,81 @@
           <w:sz w:val="24"/>
           <w:szCs w:val="24"/>
         </w:rPr>
-        <w:t xml:space="preserve">Etgar Keret's literature and the ethos of coping with Holocaust remembrance</w:t>
-      </w:r>
-      <w:r>
-        <w:rPr>
-          <w:rFonts w:ascii="David" w:cs="David" w:eastAsia="David" w:hAnsi="David"/>
-          <w:sz w:val="24"/>
-          <w:szCs w:val="24"/>
-        </w:rPr>
-        <w:t xml:space="preserve">. Cambridge Scholars Publishing.</w:t>
+        <w:t xml:space="preserve">Symposium: A Quarterly Journal in Modern Literatures, 67</w:t>
+      </w:r>
+      <w:r>
+        <w:rPr>
+          <w:rFonts w:ascii="David" w:cs="David" w:eastAsia="David" w:hAnsi="David"/>
+          <w:sz w:val="24"/>
+          <w:szCs w:val="24"/>
+        </w:rPr>
+        <w:t xml:space="preserve">(4), 189–204.</w:t>
+      </w:r>
+    </w:p>
+    <w:p>
+      <w:pPr>
+        <w:spacing w:after="160" w:line="360"/>
+        <w:ind w:left="720" w:hanging="720"/>
+        <w:jc w:val="left"/>
+      </w:pPr>
+      <w:r>
+        <w:rPr>
+          <w:rFonts w:ascii="David" w:cs="David" w:eastAsia="David" w:hAnsi="David"/>
+          <w:sz w:val="24"/>
+          <w:szCs w:val="24"/>
+        </w:rPr>
+        <w:t xml:space="preserve">Lazarus, R. S., &amp; Folkman, S. (1984). </w:t>
+      </w:r>
+      <w:r>
+        <w:rPr>
+          <w:rFonts w:ascii="David" w:cs="David" w:eastAsia="David" w:hAnsi="David"/>
+          <w:i/>
+          <w:iCs/>
+          <w:sz w:val="24"/>
+          <w:szCs w:val="24"/>
+        </w:rPr>
+        <w:t xml:space="preserve">Stress, appraisal, and coping</w:t>
+      </w:r>
+      <w:r>
+        <w:rPr>
+          <w:rFonts w:ascii="David" w:cs="David" w:eastAsia="David" w:hAnsi="David"/>
+          <w:sz w:val="24"/>
+          <w:szCs w:val="24"/>
+        </w:rPr>
+        <w:t xml:space="preserve">. Springer.</w:t>
+      </w:r>
+    </w:p>
+    <w:p>
+      <w:pPr>
+        <w:spacing w:after="160" w:line="360"/>
+        <w:ind w:left="720" w:hanging="720"/>
+        <w:jc w:val="left"/>
+      </w:pPr>
+      <w:r>
+        <w:rPr>
+          <w:rFonts w:ascii="David" w:cs="David" w:eastAsia="David" w:hAnsi="David"/>
+          <w:sz w:val="24"/>
+          <w:szCs w:val="24"/>
+        </w:rPr>
+        <w:t xml:space="preserve">Rubin, S. S. (1999). The two-track model of bereavement: Overview, retrospect, and prospect. </w:t>
+      </w:r>
+      <w:r>
+        <w:rPr>
+          <w:rFonts w:ascii="David" w:cs="David" w:eastAsia="David" w:hAnsi="David"/>
+          <w:i/>
+          <w:iCs/>
+          <w:sz w:val="24"/>
+          <w:szCs w:val="24"/>
+        </w:rPr>
+        <w:t xml:space="preserve">Death Studies, 23</w:t>
+      </w:r>
+      <w:r>
+        <w:rPr>
+          <w:rFonts w:ascii="David" w:cs="David" w:eastAsia="David" w:hAnsi="David"/>
+          <w:sz w:val="24"/>
+          <w:szCs w:val="24"/>
+        </w:rPr>
+        <w:t xml:space="preserve">(8), 681–714. https://doi.org/10.1080/074811899200731</w:t>
       </w:r>
     </w:p>
     <w:p>
@@ -796,7 +915,7 @@
           <w:szCs w:val="28"/>
           <w:rtl/>
         </w:rPr>
-        <w:t xml:space="preserve">4. מה תורם כל מקור לעבודה</w:t>
+        <w:t xml:space="preserve">4. מה תורם כל מאמר לעבודה</w:t>
       </w:r>
     </w:p>
     <w:tbl>
@@ -844,7 +963,7 @@
                 <w:szCs w:val="22"/>
                 <w:rtl/>
               </w:rPr>
-              <w:t xml:space="preserve">המקור</w:t>
+              <w:t xml:space="preserve">המאמר</w:t>
             </w:r>
           </w:p>
         </w:tc>
@@ -935,184 +1054,6 @@
                 <w:szCs w:val="22"/>
                 <w:rtl/>
               </w:rPr>
-              <w:t xml:space="preserve">טאוב (1997)</w:t>
-            </w:r>
-          </w:p>
-        </w:tc>
-        <w:tc>
-          <w:tcPr>
-            <w:tcW w:type="dxa" w:w="2600"/>
-            <w:tcMar>
-              <w:top w:type="dxa" w:w="80"/>
-              <w:left w:type="dxa" w:w="100"/>
-              <w:bottom w:type="dxa" w:w="80"/>
-              <w:right w:type="dxa" w:w="100"/>
-            </w:tcMar>
-          </w:tcPr>
-          <w:p>
-            <w:pPr>
-              <w:bidi/>
-              <w:spacing w:after="0" w:line="300"/>
-              <w:jc w:val="right"/>
-            </w:pPr>
-            <w:r>
-              <w:rPr>
-                <w:rFonts w:ascii="David" w:cs="David" w:eastAsia="David" w:hAnsi="David"/>
-                <w:b w:val="false"/>
-                <w:bCs w:val="false"/>
-                <w:sz w:val="22"/>
-                <w:szCs w:val="22"/>
-                <w:rtl/>
-              </w:rPr>
-              <w:t xml:space="preserve">תרבות צעירה ופוסטמודרניזם בישראל</w:t>
-            </w:r>
-          </w:p>
-        </w:tc>
-        <w:tc>
-          <w:tcPr>
-            <w:tcW w:type="dxa" w:w="4400"/>
-            <w:tcMar>
-              <w:top w:type="dxa" w:w="80"/>
-              <w:left w:type="dxa" w:w="100"/>
-              <w:bottom w:type="dxa" w:w="80"/>
-              <w:right w:type="dxa" w:w="100"/>
-            </w:tcMar>
-          </w:tcPr>
-          <w:p>
-            <w:pPr>
-              <w:bidi/>
-              <w:spacing w:after="0" w:line="300"/>
-              <w:jc w:val="right"/>
-            </w:pPr>
-            <w:r>
-              <w:rPr>
-                <w:rFonts w:ascii="David" w:cs="David" w:eastAsia="David" w:hAnsi="David"/>
-                <w:b w:val="false"/>
-                <w:bCs w:val="false"/>
-                <w:sz w:val="22"/>
-                <w:szCs w:val="22"/>
-                <w:rtl/>
-              </w:rPr>
-              <w:t xml:space="preserve">מיקום קרת בדור הסופרים של שנות התשעים; הנטייה לסגת מן הציבורי אל הפרטי כדרך התמודדות (מבוא, פרק 2)</w:t>
-            </w:r>
-          </w:p>
-        </w:tc>
-      </w:tr>
-      <w:tr>
-        <w:tc>
-          <w:tcPr>
-            <w:tcW w:type="dxa" w:w="2000"/>
-            <w:tcMar>
-              <w:top w:type="dxa" w:w="80"/>
-              <w:left w:type="dxa" w:w="100"/>
-              <w:bottom w:type="dxa" w:w="80"/>
-              <w:right w:type="dxa" w:w="100"/>
-            </w:tcMar>
-          </w:tcPr>
-          <w:p>
-            <w:pPr>
-              <w:bidi/>
-              <w:spacing w:after="0" w:line="300"/>
-              <w:jc w:val="right"/>
-            </w:pPr>
-            <w:r>
-              <w:rPr>
-                <w:rFonts w:ascii="David" w:cs="David" w:eastAsia="David" w:hAnsi="David"/>
-                <w:b w:val="false"/>
-                <w:bCs w:val="false"/>
-                <w:sz w:val="22"/>
-                <w:szCs w:val="22"/>
-                <w:rtl/>
-              </w:rPr>
-              <w:t xml:space="preserve">מנדלסון-מעוז (1998)</w:t>
-            </w:r>
-          </w:p>
-        </w:tc>
-        <w:tc>
-          <w:tcPr>
-            <w:tcW w:type="dxa" w:w="2600"/>
-            <w:tcMar>
-              <w:top w:type="dxa" w:w="80"/>
-              <w:left w:type="dxa" w:w="100"/>
-              <w:bottom w:type="dxa" w:w="80"/>
-              <w:right w:type="dxa" w:w="100"/>
-            </w:tcMar>
-          </w:tcPr>
-          <w:p>
-            <w:pPr>
-              <w:bidi/>
-              <w:spacing w:after="0" w:line="300"/>
-              <w:jc w:val="right"/>
-            </w:pPr>
-            <w:r>
-              <w:rPr>
-                <w:rFonts w:ascii="David" w:cs="David" w:eastAsia="David" w:hAnsi="David"/>
-                <w:b w:val="false"/>
-                <w:bCs w:val="false"/>
-                <w:sz w:val="22"/>
-                <w:szCs w:val="22"/>
-                <w:rtl/>
-              </w:rPr>
-              <w:t xml:space="preserve">מצבי קיצון, זוועה וגרוטסקה</w:t>
-            </w:r>
-          </w:p>
-        </w:tc>
-        <w:tc>
-          <w:tcPr>
-            <w:tcW w:type="dxa" w:w="4400"/>
-            <w:tcMar>
-              <w:top w:type="dxa" w:w="80"/>
-              <w:left w:type="dxa" w:w="100"/>
-              <w:bottom w:type="dxa" w:w="80"/>
-              <w:right w:type="dxa" w:w="100"/>
-            </w:tcMar>
-          </w:tcPr>
-          <w:p>
-            <w:pPr>
-              <w:bidi/>
-              <w:spacing w:after="0" w:line="300"/>
-              <w:jc w:val="right"/>
-            </w:pPr>
-            <w:r>
-              <w:rPr>
-                <w:rFonts w:ascii="David" w:cs="David" w:eastAsia="David" w:hAnsi="David"/>
-                <w:b w:val="false"/>
-                <w:bCs w:val="false"/>
-                <w:sz w:val="22"/>
-                <w:szCs w:val="22"/>
-                <w:rtl/>
-              </w:rPr>
-              <w:t xml:space="preserve">ניתוח הבית הסגור והקולות ב"האנשים החלולים" כסיטואציה קיצונית שהדמויות מגיבות לה בשגרה (פרק 3)</w:t>
-            </w:r>
-          </w:p>
-        </w:tc>
-      </w:tr>
-      <w:tr>
-        <w:tc>
-          <w:tcPr>
-            <w:tcW w:type="dxa" w:w="2000"/>
-            <w:tcMar>
-              <w:top w:type="dxa" w:w="80"/>
-              <w:left w:type="dxa" w:w="100"/>
-              <w:bottom w:type="dxa" w:w="80"/>
-              <w:right w:type="dxa" w:w="100"/>
-            </w:tcMar>
-          </w:tcPr>
-          <w:p>
-            <w:pPr>
-              <w:bidi/>
-              <w:spacing w:after="0" w:line="300"/>
-              <w:jc w:val="right"/>
-            </w:pPr>
-            <w:r>
-              <w:rPr>
-                <w:rFonts w:ascii="David" w:cs="David" w:eastAsia="David" w:hAnsi="David"/>
-                <w:b w:val="false"/>
-                <w:bCs w:val="false"/>
-                <w:sz w:val="22"/>
-                <w:szCs w:val="22"/>
-                <w:rtl/>
-              </w:rPr>
               <w:t xml:space="preserve">קצמן (2005)</w:t>
             </w:r>
           </w:p>
@@ -1171,7 +1112,274 @@
                 <w:szCs w:val="22"/>
                 <w:rtl/>
               </w:rPr>
-              <w:t xml:space="preserve">הפנטזיה כבניית עולם פרטי בעל חוקים משלו; אחריות מוסרית של המספר (פרקים 3–5)</w:t>
+              <w:t xml:space="preserve">הדמויות בונות עולם פרטי בעל חוקים משלו: הבית הסגור של האב, המינימליזם של הסופר (פרקים 2–3)</w:t>
+            </w:r>
+          </w:p>
+        </w:tc>
+      </w:tr>
+      <w:tr>
+        <w:tc>
+          <w:tcPr>
+            <w:tcW w:type="dxa" w:w="2000"/>
+            <w:tcMar>
+              <w:top w:type="dxa" w:w="80"/>
+              <w:left w:type="dxa" w:w="100"/>
+              <w:bottom w:type="dxa" w:w="80"/>
+              <w:right w:type="dxa" w:w="100"/>
+            </w:tcMar>
+          </w:tcPr>
+          <w:p>
+            <w:pPr>
+              <w:bidi/>
+              <w:spacing w:after="0" w:line="300"/>
+              <w:jc w:val="right"/>
+            </w:pPr>
+            <w:r>
+              <w:rPr>
+                <w:rFonts w:ascii="David" w:cs="David" w:eastAsia="David" w:hAnsi="David"/>
+                <w:b w:val="false"/>
+                <w:bCs w:val="false"/>
+                <w:sz w:val="22"/>
+                <w:szCs w:val="22"/>
+                <w:rtl/>
+              </w:rPr>
+              <w:t xml:space="preserve">כהן (2015)</w:t>
+            </w:r>
+          </w:p>
+        </w:tc>
+        <w:tc>
+          <w:tcPr>
+            <w:tcW w:type="dxa" w:w="2600"/>
+            <w:tcMar>
+              <w:top w:type="dxa" w:w="80"/>
+              <w:left w:type="dxa" w:w="100"/>
+              <w:bottom w:type="dxa" w:w="80"/>
+              <w:right w:type="dxa" w:w="100"/>
+            </w:tcMar>
+          </w:tcPr>
+          <w:p>
+            <w:pPr>
+              <w:bidi/>
+              <w:spacing w:after="0" w:line="300"/>
+              <w:jc w:val="right"/>
+            </w:pPr>
+            <w:r>
+              <w:rPr>
+                <w:rFonts w:ascii="David" w:cs="David" w:eastAsia="David" w:hAnsi="David"/>
+                <w:b w:val="false"/>
+                <w:bCs w:val="false"/>
+                <w:sz w:val="22"/>
+                <w:szCs w:val="22"/>
+                <w:rtl/>
+              </w:rPr>
+              <w:t xml:space="preserve">אבל הורים אחרי מות ילד</w:t>
+            </w:r>
+          </w:p>
+        </w:tc>
+        <w:tc>
+          <w:tcPr>
+            <w:tcW w:type="dxa" w:w="4400"/>
+            <w:tcMar>
+              <w:top w:type="dxa" w:w="80"/>
+              <w:left w:type="dxa" w:w="100"/>
+              <w:bottom w:type="dxa" w:w="80"/>
+              <w:right w:type="dxa" w:w="100"/>
+            </w:tcMar>
+          </w:tcPr>
+          <w:p>
+            <w:pPr>
+              <w:bidi/>
+              <w:spacing w:after="0" w:line="300"/>
+              <w:jc w:val="right"/>
+            </w:pPr>
+            <w:r>
+              <w:rPr>
+                <w:rFonts w:ascii="David" w:cs="David" w:eastAsia="David" w:hAnsi="David"/>
+                <w:b w:val="false"/>
+                <w:bCs w:val="false"/>
+                <w:sz w:val="22"/>
+                <w:szCs w:val="22"/>
+                <w:rtl/>
+              </w:rPr>
+              <w:t xml:space="preserve">הסופר האמריקאי שאיבד ילד ופירק משפחה; אובדן כמפרק זהות משפחתית (רקע תאורטי, פרק 3)</w:t>
+            </w:r>
+          </w:p>
+        </w:tc>
+      </w:tr>
+      <w:tr>
+        <w:tc>
+          <w:tcPr>
+            <w:tcW w:type="dxa" w:w="2000"/>
+            <w:tcMar>
+              <w:top w:type="dxa" w:w="80"/>
+              <w:left w:type="dxa" w:w="100"/>
+              <w:bottom w:type="dxa" w:w="80"/>
+              <w:right w:type="dxa" w:w="100"/>
+            </w:tcMar>
+          </w:tcPr>
+          <w:p>
+            <w:pPr>
+              <w:bidi/>
+              <w:spacing w:after="0" w:line="300"/>
+              <w:jc w:val="right"/>
+            </w:pPr>
+            <w:r>
+              <w:rPr>
+                <w:rFonts w:ascii="David" w:cs="David" w:eastAsia="David" w:hAnsi="David"/>
+                <w:b w:val="false"/>
+                <w:bCs w:val="false"/>
+                <w:sz w:val="22"/>
+                <w:szCs w:val="22"/>
+                <w:rtl/>
+              </w:rPr>
+              <w:t xml:space="preserve">Abramovich (2019)</w:t>
+            </w:r>
+          </w:p>
+        </w:tc>
+        <w:tc>
+          <w:tcPr>
+            <w:tcW w:type="dxa" w:w="2600"/>
+            <w:tcMar>
+              <w:top w:type="dxa" w:w="80"/>
+              <w:left w:type="dxa" w:w="100"/>
+              <w:bottom w:type="dxa" w:w="80"/>
+              <w:right w:type="dxa" w:w="100"/>
+            </w:tcMar>
+          </w:tcPr>
+          <w:p>
+            <w:pPr>
+              <w:bidi/>
+              <w:spacing w:after="0" w:line="300"/>
+              <w:jc w:val="right"/>
+            </w:pPr>
+            <w:r>
+              <w:rPr>
+                <w:rFonts w:ascii="David" w:cs="David" w:eastAsia="David" w:hAnsi="David"/>
+                <w:b w:val="false"/>
+                <w:bCs w:val="false"/>
+                <w:sz w:val="22"/>
+                <w:szCs w:val="22"/>
+                <w:rtl/>
+              </w:rPr>
+              <w:t xml:space="preserve">זיכרון השואה, הדור השלישי, אשמה</w:t>
+            </w:r>
+          </w:p>
+        </w:tc>
+        <w:tc>
+          <w:tcPr>
+            <w:tcW w:type="dxa" w:w="4400"/>
+            <w:tcMar>
+              <w:top w:type="dxa" w:w="80"/>
+              <w:left w:type="dxa" w:w="100"/>
+              <w:bottom w:type="dxa" w:w="80"/>
+              <w:right w:type="dxa" w:w="100"/>
+            </w:tcMar>
+          </w:tcPr>
+          <w:p>
+            <w:pPr>
+              <w:bidi/>
+              <w:spacing w:after="0" w:line="300"/>
+              <w:jc w:val="right"/>
+            </w:pPr>
+            <w:r>
+              <w:rPr>
+                <w:rFonts w:ascii="David" w:cs="David" w:eastAsia="David" w:hAnsi="David"/>
+                <w:b w:val="false"/>
+                <w:bCs w:val="false"/>
+                <w:sz w:val="22"/>
+                <w:szCs w:val="22"/>
+                <w:rtl/>
+              </w:rPr>
+              <w:t xml:space="preserve">אשמה וחרטה של ילד כלפי דור ההורים והסבים; זיכרון פרטי מול ממלכתי (מבוא, פרק 2)</w:t>
+            </w:r>
+          </w:p>
+        </w:tc>
+      </w:tr>
+      <w:tr>
+        <w:tc>
+          <w:tcPr>
+            <w:tcW w:type="dxa" w:w="2000"/>
+            <w:tcMar>
+              <w:top w:type="dxa" w:w="80"/>
+              <w:left w:type="dxa" w:w="100"/>
+              <w:bottom w:type="dxa" w:w="80"/>
+              <w:right w:type="dxa" w:w="100"/>
+            </w:tcMar>
+          </w:tcPr>
+          <w:p>
+            <w:pPr>
+              <w:bidi/>
+              <w:spacing w:after="0" w:line="300"/>
+              <w:jc w:val="right"/>
+            </w:pPr>
+            <w:r>
+              <w:rPr>
+                <w:rFonts w:ascii="David" w:cs="David" w:eastAsia="David" w:hAnsi="David"/>
+                <w:b w:val="false"/>
+                <w:bCs w:val="false"/>
+                <w:sz w:val="22"/>
+                <w:szCs w:val="22"/>
+                <w:rtl/>
+              </w:rPr>
+              <w:t xml:space="preserve">Mendelson-Maoz (2018)</w:t>
+            </w:r>
+          </w:p>
+        </w:tc>
+        <w:tc>
+          <w:tcPr>
+            <w:tcW w:type="dxa" w:w="2600"/>
+            <w:tcMar>
+              <w:top w:type="dxa" w:w="80"/>
+              <w:left w:type="dxa" w:w="100"/>
+              <w:bottom w:type="dxa" w:w="80"/>
+              <w:right w:type="dxa" w:w="100"/>
+            </w:tcMar>
+          </w:tcPr>
+          <w:p>
+            <w:pPr>
+              <w:bidi/>
+              <w:spacing w:after="0" w:line="300"/>
+              <w:jc w:val="right"/>
+            </w:pPr>
+            <w:r>
+              <w:rPr>
+                <w:rFonts w:ascii="David" w:cs="David" w:eastAsia="David" w:hAnsi="David"/>
+                <w:b w:val="false"/>
+                <w:bCs w:val="false"/>
+                <w:sz w:val="22"/>
+                <w:szCs w:val="22"/>
+                <w:rtl/>
+              </w:rPr>
+              <w:t xml:space="preserve">"המתים-החיים", קורבן וגבריות</w:t>
+            </w:r>
+          </w:p>
+        </w:tc>
+        <w:tc>
+          <w:tcPr>
+            <w:tcW w:type="dxa" w:w="4400"/>
+            <w:tcMar>
+              <w:top w:type="dxa" w:w="80"/>
+              <w:left w:type="dxa" w:w="100"/>
+              <w:bottom w:type="dxa" w:w="80"/>
+              <w:right w:type="dxa" w:w="100"/>
+            </w:tcMar>
+          </w:tcPr>
+          <w:p>
+            <w:pPr>
+              <w:bidi/>
+              <w:spacing w:after="0" w:line="300"/>
+              <w:jc w:val="right"/>
+            </w:pPr>
+            <w:r>
+              <w:rPr>
+                <w:rFonts w:ascii="David" w:cs="David" w:eastAsia="David" w:hAnsi="David"/>
+                <w:b w:val="false"/>
+                <w:bCs w:val="false"/>
+                <w:sz w:val="22"/>
+                <w:szCs w:val="22"/>
+                <w:rtl/>
+              </w:rPr>
+              <w:t xml:space="preserve">האנשים החלולים כמתים-חיים; האב שמת בפינה; הבן שנעשה אחד מהם (פרק 2, פרק 4)</w:t>
             </w:r>
           </w:p>
         </w:tc>
@@ -1231,7 +1439,7 @@
                 <w:szCs w:val="22"/>
                 <w:rtl/>
               </w:rPr>
-              <w:t xml:space="preserve">הדור השני לשואה, זיכרון משפחתי</w:t>
+              <w:t xml:space="preserve">הדור השני, משפחה וזיכרון</w:t>
             </w:r>
           </w:p>
         </w:tc>
@@ -1260,7 +1468,7 @@
                 <w:szCs w:val="22"/>
                 <w:rtl/>
               </w:rPr>
-              <w:t xml:space="preserve">יחסי אב–בן, הורשה של פחד ושל "קולות", ההומור והפנטזיה כדרך לחיות עם הטראומה (פרקים 3, 5)</w:t>
+              <w:t xml:space="preserve">יחסי אב–בן, הורשת הפחד, ההומור כדרך לחיות עם הטראומה (רקע תאורטי, פרק 2, דיון)</w:t>
             </w:r>
           </w:p>
         </w:tc>
@@ -1291,7 +1499,7 @@
                 <w:szCs w:val="22"/>
                 <w:rtl/>
               </w:rPr>
-              <w:t xml:space="preserve">Lazarus &amp; Folkman (1984)</w:t>
+              <w:t xml:space="preserve">Schwartz (2018)</w:t>
             </w:r>
           </w:p>
         </w:tc>
@@ -1320,7 +1528,7 @@
                 <w:szCs w:val="22"/>
                 <w:rtl/>
               </w:rPr>
-              <w:t xml:space="preserve">פסיכולוגיה של לחץ והתמודדות</w:t>
+              <w:t xml:space="preserve">ההומור ו"סתם" אצל קרת</w:t>
             </w:r>
           </w:p>
         </w:tc>
@@ -1349,96 +1557,7 @@
                 <w:szCs w:val="22"/>
                 <w:rtl/>
               </w:rPr>
-              <w:t xml:space="preserve">המסגרת המושגית: התמודדות ממוקדת-בעיה, ממוקדת-רגש והימנעות (פרק 2, וכלי הניתוח בפרקים 3–4)</w:t>
-            </w:r>
-          </w:p>
-        </w:tc>
-      </w:tr>
-      <w:tr>
-        <w:tc>
-          <w:tcPr>
-            <w:tcW w:type="dxa" w:w="2000"/>
-            <w:tcMar>
-              <w:top w:type="dxa" w:w="80"/>
-              <w:left w:type="dxa" w:w="100"/>
-              <w:bottom w:type="dxa" w:w="80"/>
-              <w:right w:type="dxa" w:w="100"/>
-            </w:tcMar>
-          </w:tcPr>
-          <w:p>
-            <w:pPr>
-              <w:bidi/>
-              <w:spacing w:after="0" w:line="300"/>
-              <w:jc w:val="right"/>
-            </w:pPr>
-            <w:r>
-              <w:rPr>
-                <w:rFonts w:ascii="David" w:cs="David" w:eastAsia="David" w:hAnsi="David"/>
-                <w:b w:val="false"/>
-                <w:bCs w:val="false"/>
-                <w:sz w:val="22"/>
-                <w:szCs w:val="22"/>
-                <w:rtl/>
-              </w:rPr>
-              <w:t xml:space="preserve">Rubin (1999)</w:t>
-            </w:r>
-          </w:p>
-        </w:tc>
-        <w:tc>
-          <w:tcPr>
-            <w:tcW w:type="dxa" w:w="2600"/>
-            <w:tcMar>
-              <w:top w:type="dxa" w:w="80"/>
-              <w:left w:type="dxa" w:w="100"/>
-              <w:bottom w:type="dxa" w:w="80"/>
-              <w:right w:type="dxa" w:w="100"/>
-            </w:tcMar>
-          </w:tcPr>
-          <w:p>
-            <w:pPr>
-              <w:bidi/>
-              <w:spacing w:after="0" w:line="300"/>
-              <w:jc w:val="right"/>
-            </w:pPr>
-            <w:r>
-              <w:rPr>
-                <w:rFonts w:ascii="David" w:cs="David" w:eastAsia="David" w:hAnsi="David"/>
-                <w:b w:val="false"/>
-                <w:bCs w:val="false"/>
-                <w:sz w:val="22"/>
-                <w:szCs w:val="22"/>
-                <w:rtl/>
-              </w:rPr>
-              <w:t xml:space="preserve">אובדן ושכול – מודל דו-מסלולי</w:t>
-            </w:r>
-          </w:p>
-        </w:tc>
-        <w:tc>
-          <w:tcPr>
-            <w:tcW w:type="dxa" w:w="4400"/>
-            <w:tcMar>
-              <w:top w:type="dxa" w:w="80"/>
-              <w:left w:type="dxa" w:w="100"/>
-              <w:bottom w:type="dxa" w:w="80"/>
-              <w:right w:type="dxa" w:w="100"/>
-            </w:tcMar>
-          </w:tcPr>
-          <w:p>
-            <w:pPr>
-              <w:bidi/>
-              <w:spacing w:after="0" w:line="300"/>
-              <w:jc w:val="right"/>
-            </w:pPr>
-            <w:r>
-              <w:rPr>
-                <w:rFonts w:ascii="David" w:cs="David" w:eastAsia="David" w:hAnsi="David"/>
-                <w:b w:val="false"/>
-                <w:bCs w:val="false"/>
-                <w:sz w:val="22"/>
-                <w:szCs w:val="22"/>
-                <w:rtl/>
-              </w:rPr>
-              <w:t xml:space="preserve">מות האם והאב ב"האנשים החלולים"; התפקוד לעומת הקשר המתמשך למת (פרקים 3, 5)</w:t>
+              <w:t xml:space="preserve">"סתם קולות", "סתם, ממש סתם", הצוואר – הבנאלי כהתמודדות לא-קורבנית (פרקים 2–3, דיון)</w:t>
             </w:r>
           </w:p>
         </w:tc>
@@ -1477,7 +1596,7 @@
           <w:szCs w:val="24"/>
           <w:rtl/>
         </w:rPr>
-        <w:t xml:space="preserve">הערה על APA 7 בעברית: שם משפחה, ראשי תיבות של השם הפרטי עם גרש (א'), שנה בסוגריים, שם הספר או כתב העת באות נטויה, ללא ציון עיר ההוצאה. בגוף העבודה מצטטים כך: (מנדלסון-מעוז, 1998, עמ' 271) או Lazarus &amp; Folkman, 1984).</w:t>
+        <w:t xml:space="preserve">הערה על APA 7 בעברית: שם משפחה, ראשי תיבות של השם הפרטי עם גרש (א'), שנה בסוגריים, שם הספר או כתב העת באות נטויה, ללא ציון עיר ההוצאה. בגוף העבודה מצטטים כך: (קצמן, 2005, עמ' 22) או (Schwartz, 2018).</w:t>
       </w:r>
     </w:p>
     <w:p>

</xml_diff>